<commit_message>
Housekeeping (B): commit the 150 pending deletions — supersessions & artefacts
All safety-archived to backups/worktree_safety_2026-07-08.zip (596 files, 21MB).
Breakdown of the 14 that weren't cleanly in scripts/archive/:
- 4 sqlite -shm/-wal sidecars (regenerate on next open)
- 3 ops_dashboard_{BACKUP,fixed_header,indented}.py — old snapshots; the live
  file is ops_dashboard.py
- repro_st_gat.py + run_st_gat_dashboard.bat — superseded by
  ConsolidatedTransferService + run_stgat.bat
- 5 verify_*.py — one-off diagnostic scripts; the pytest suite (681 tests)
  covers what they checked; local drift in the archive copies is the debug
  scratch from before archival, not lost logic

The remaining 136 deletions match their scripts/archive/ copies byte-for-byte
(hash-verified) — the move was recorded here.

Co-Authored-By: Claude Opus 4.8 <noreply@anthropic.com>
</commit_message>
<xml_diff>
--- a/test_shadow_report.docx
+++ b/test_shadow_report.docx
@@ -43,7 +43,7 @@
           <w:i/>
           <w:sz w:val="22"/>
         </w:rPr>
-        <w:t>Generated: 2026-04-05 15:40:52</w:t>
+        <w:t>Generated: 2026-06-22 20:50:18</w:t>
       </w:r>
     </w:p>
     <w:p>
@@ -136,7 +136,7 @@
               <w:rPr>
                 <w:sz w:val="18"/>
               </w:rPr>
-              <w:t>9461</w:t>
+              <w:t>23481</w:t>
             </w:r>
           </w:p>
         </w:tc>
@@ -164,7 +164,35 @@
               <w:rPr>
                 <w:sz w:val="18"/>
               </w:rPr>
-              <w:t>KES 11,592,852.46</w:t>
+              <w:t>KES 13,460,300.00</w:t>
+            </w:r>
+          </w:p>
+        </w:tc>
+      </w:tr>
+      <w:tr>
+        <w:tc>
+          <w:tcPr>
+            <w:tcW w:type="dxa" w:w="4320"/>
+          </w:tcPr>
+          <w:p>
+            <w:r>
+              <w:rPr>
+                <w:sz w:val="18"/>
+              </w:rPr>
+              <w:t>Human Over-Order Waste Risk (17% WACC)</w:t>
+            </w:r>
+          </w:p>
+        </w:tc>
+        <w:tc>
+          <w:tcPr>
+            <w:tcW w:type="dxa" w:w="4320"/>
+          </w:tcPr>
+          <w:p>
+            <w:r>
+              <w:rPr>
+                <w:sz w:val="18"/>
+              </w:rPr>
+              <w:t>KES 0.00</w:t>
             </w:r>
           </w:p>
         </w:tc>
@@ -192,7 +220,7 @@
               <w:rPr>
                 <w:sz w:val="18"/>
               </w:rPr>
-              <w:t>13</w:t>
+              <w:t>0</w:t>
             </w:r>
           </w:p>
         </w:tc>
@@ -220,7 +248,7 @@
               <w:rPr>
                 <w:sz w:val="18"/>
               </w:rPr>
-              <w:t>0.1%</w:t>
+              <w:t>0.0%</w:t>
             </w:r>
           </w:p>
         </w:tc>
@@ -250,7 +278,7 @@
     </w:p>
     <w:p>
       <w:r>
-        <w:t>The human buyer failed to order 9411 items that O.A.S.I.S. identified as requiring replenishment based on current velocity and lead times. This represents an immediate stockout risk.</w:t>
+        <w:t>The human buyer failed to order 23481 items that O.A.S.I.S. identified as requiring replenishment based on current velocity and lead times. This represents an immediate stockout risk.</w:t>
       </w:r>
     </w:p>
     <w:tbl>
@@ -334,7 +362,7 @@
               <w:rPr>
                 <w:sz w:val="18"/>
               </w:rPr>
-              <w:t>151 SAP056 SEAL A PACK 60 PRESS &amp; SEAL F</w:t>
+              <w:t>BROOKSIDE 500ML DAIRY BEST (POUCH)</w:t>
             </w:r>
           </w:p>
         </w:tc>
@@ -347,7 +375,7 @@
               <w:rPr>
                 <w:sz w:val="18"/>
               </w:rPr>
-              <w:t>1</w:t>
+              <w:t>4760</w:t>
             </w:r>
           </w:p>
         </w:tc>
@@ -373,7 +401,7 @@
               <w:rPr>
                 <w:sz w:val="18"/>
               </w:rPr>
-              <w:t>KES 465.00</w:t>
+              <w:t>KES 476,000.00</w:t>
             </w:r>
           </w:p>
         </w:tc>
@@ -388,7 +416,7 @@
               <w:rPr>
                 <w:sz w:val="18"/>
               </w:rPr>
-              <w:t>151 SET OF 3 VANILLA &amp; COCONUT CANDLES #</w:t>
+              <w:t>BIO 2L WHOLE FRESH MILK</w:t>
             </w:r>
           </w:p>
         </w:tc>
@@ -401,7 +429,7 @@
               <w:rPr>
                 <w:sz w:val="18"/>
               </w:rPr>
-              <w:t>1</w:t>
+              <w:t>38</w:t>
             </w:r>
           </w:p>
         </w:tc>
@@ -427,7 +455,7 @@
               <w:rPr>
                 <w:sz w:val="18"/>
               </w:rPr>
-              <w:t>KES 465.00</w:t>
+              <w:t>KES 3,800.00</w:t>
             </w:r>
           </w:p>
         </w:tc>
@@ -442,7 +470,7 @@
               <w:rPr>
                 <w:sz w:val="18"/>
               </w:rPr>
-              <w:t>18 CABERNET SAUV 750ML</w:t>
+              <w:t>KERINGET 18.9LT MINERAL WATER REFIL</w:t>
             </w:r>
           </w:p>
         </w:tc>
@@ -455,7 +483,7 @@
               <w:rPr>
                 <w:sz w:val="18"/>
               </w:rPr>
-              <w:t>1</w:t>
+              <w:t>481</w:t>
             </w:r>
           </w:p>
         </w:tc>
@@ -481,7 +509,7 @@
               <w:rPr>
                 <w:sz w:val="18"/>
               </w:rPr>
-              <w:t>KES 1,549.00</w:t>
+              <w:t>KES 48,100.00</w:t>
             </w:r>
           </w:p>
         </w:tc>
@@ -496,7 +524,7 @@
               <w:rPr>
                 <w:sz w:val="18"/>
               </w:rPr>
-              <w:t>1935 CUVEE 750ML TRAD BORDEAUX</w:t>
+              <w:t>DUNHILL 20S SWITCH</w:t>
             </w:r>
           </w:p>
         </w:tc>
@@ -509,7 +537,7 @@
               <w:rPr>
                 <w:sz w:val="18"/>
               </w:rPr>
-              <w:t>2</w:t>
+              <w:t>407</w:t>
             </w:r>
           </w:p>
         </w:tc>
@@ -535,7 +563,7 @@
               <w:rPr>
                 <w:sz w:val="18"/>
               </w:rPr>
-              <w:t>KES 5,218.00</w:t>
+              <w:t>KES 40,700.00</w:t>
             </w:r>
           </w:p>
         </w:tc>
@@ -550,7 +578,7 @@
               <w:rPr>
                 <w:sz w:val="18"/>
               </w:rPr>
-              <w:t>224 5KG LONG GRAIN RICE</w:t>
+              <w:t>EMBASSY BY DUNHILL BLUE 20S</w:t>
             </w:r>
           </w:p>
         </w:tc>
@@ -563,7 +591,7 @@
               <w:rPr>
                 <w:sz w:val="18"/>
               </w:rPr>
-              <w:t>1</w:t>
+              <w:t>397</w:t>
             </w:r>
           </w:p>
         </w:tc>
@@ -589,7 +617,7 @@
               <w:rPr>
                 <w:sz w:val="18"/>
               </w:rPr>
-              <w:t>KES 996.91</w:t>
+              <w:t>KES 39,700.00</w:t>
             </w:r>
           </w:p>
         </w:tc>
@@ -604,7 +632,7 @@
               <w:rPr>
                 <w:sz w:val="18"/>
               </w:rPr>
-              <w:t>254 330ML MURATATU TRIPEL BEER</w:t>
+              <w:t>GOLD 500ML CROWN TFA 20</w:t>
             </w:r>
           </w:p>
         </w:tc>
@@ -617,7 +645,7 @@
               <w:rPr>
                 <w:sz w:val="18"/>
               </w:rPr>
-              <w:t>4</w:t>
+              <w:t>618</w:t>
             </w:r>
           </w:p>
         </w:tc>
@@ -643,7 +671,7 @@
               <w:rPr>
                 <w:sz w:val="18"/>
               </w:rPr>
-              <w:t>KES 914.77</w:t>
+              <w:t>KES 61,800.00</w:t>
             </w:r>
           </w:p>
         </w:tc>
@@ -658,7 +686,7 @@
               <w:rPr>
                 <w:sz w:val="18"/>
               </w:rPr>
-              <w:t>254 GOLDEN RUMP 330ML BEER</w:t>
+              <w:t>RINSUN 5LT SUNFLOWER OIL</w:t>
             </w:r>
           </w:p>
         </w:tc>
@@ -671,7 +699,7 @@
               <w:rPr>
                 <w:sz w:val="18"/>
               </w:rPr>
-              <w:t>11</w:t>
+              <w:t>116</w:t>
             </w:r>
           </w:p>
         </w:tc>
@@ -697,7 +725,7 @@
               <w:rPr>
                 <w:sz w:val="18"/>
               </w:rPr>
-              <w:t>KES 2,515.60</w:t>
+              <w:t>KES 11,600.00</w:t>
             </w:r>
           </w:p>
         </w:tc>
@@ -712,7 +740,7 @@
               <w:rPr>
                 <w:sz w:val="18"/>
               </w:rPr>
-              <w:t>254 NIAJE 330ML LAGER BEER</w:t>
+              <w:t>WHITE CAP 500ML LAGER CANS</w:t>
             </w:r>
           </w:p>
         </w:tc>
@@ -725,7 +753,7 @@
               <w:rPr>
                 <w:sz w:val="18"/>
               </w:rPr>
-              <w:t>7</w:t>
+              <w:t>744</w:t>
             </w:r>
           </w:p>
         </w:tc>
@@ -751,7 +779,7 @@
               <w:rPr>
                 <w:sz w:val="18"/>
               </w:rPr>
-              <w:t>KES 1,600.84</w:t>
+              <w:t>KES 74,400.00</w:t>
             </w:r>
           </w:p>
         </w:tc>
@@ -766,7 +794,7 @@
               <w:rPr>
                 <w:sz w:val="18"/>
               </w:rPr>
-              <w:t>254 SAND TRAP 330ML BEER</w:t>
+              <w:t>AQUAMIST 20LT MINERAL WATER</w:t>
             </w:r>
           </w:p>
         </w:tc>
@@ -779,7 +807,7 @@
               <w:rPr>
                 <w:sz w:val="18"/>
               </w:rPr>
-              <w:t>9</w:t>
+              <w:t>365</w:t>
             </w:r>
           </w:p>
         </w:tc>
@@ -805,7 +833,7 @@
               <w:rPr>
                 <w:sz w:val="18"/>
               </w:rPr>
-              <w:t>KES 2,058.22</w:t>
+              <w:t>KES 36,500.00</w:t>
             </w:r>
           </w:p>
         </w:tc>
@@ -820,7 +848,7 @@
               <w:rPr>
                 <w:sz w:val="18"/>
               </w:rPr>
-              <w:t>4TH STREET 750ML SWEET RED WINE</w:t>
+              <w:t>ILARA FRESH MILK 500ML SATCHET</w:t>
             </w:r>
           </w:p>
         </w:tc>
@@ -833,7 +861,7 @@
               <w:rPr>
                 <w:sz w:val="18"/>
               </w:rPr>
-              <w:t>1</w:t>
+              <w:t>133</w:t>
             </w:r>
           </w:p>
         </w:tc>
@@ -859,7 +887,7 @@
               <w:rPr>
                 <w:sz w:val="18"/>
               </w:rPr>
-              <w:t>KES 1,079.00</w:t>
+              <w:t>KES 13,300.00</w:t>
             </w:r>
           </w:p>
         </w:tc>
@@ -874,7 +902,7 @@
               <w:rPr>
                 <w:sz w:val="18"/>
               </w:rPr>
-              <w:t>58 GIN&amp;TONIC 330ML SPICED ORANGE</w:t>
+              <w:t>BROOKSIDE 1LT UHT WHOLE MILK</w:t>
             </w:r>
           </w:p>
         </w:tc>
@@ -887,7 +915,7 @@
               <w:rPr>
                 <w:sz w:val="18"/>
               </w:rPr>
-              <w:t>5</w:t>
+              <w:t>218</w:t>
             </w:r>
           </w:p>
         </w:tc>
@@ -913,7 +941,7 @@
               <w:rPr>
                 <w:sz w:val="18"/>
               </w:rPr>
-              <w:t>KES 1,147.21</w:t>
+              <w:t>KES 21,800.00</w:t>
             </w:r>
           </w:p>
         </w:tc>
@@ -928,7 +956,7 @@
               <w:rPr>
                 <w:sz w:val="18"/>
               </w:rPr>
-              <w:t>58 GIN&amp;TONIC 330ML THE CLASSIC</w:t>
+              <w:t>ISINYA 30S EGGS</w:t>
             </w:r>
           </w:p>
         </w:tc>
@@ -941,7 +969,7 @@
               <w:rPr>
                 <w:sz w:val="18"/>
               </w:rPr>
-              <w:t>7</w:t>
+              <w:t>108</w:t>
             </w:r>
           </w:p>
         </w:tc>
@@ -967,7 +995,7 @@
               <w:rPr>
                 <w:sz w:val="18"/>
               </w:rPr>
-              <w:t>KES 1,606.10</w:t>
+              <w:t>KES 10,800.00</w:t>
             </w:r>
           </w:p>
         </w:tc>
@@ -982,7 +1010,7 @@
               <w:rPr>
                 <w:sz w:val="18"/>
               </w:rPr>
-              <w:t>58 GIN&amp;TONIC 330ML VERY BERRY</w:t>
+              <w:t>KERINGET 18.9LT MINERAL WATER REFIL EMPT</w:t>
             </w:r>
           </w:p>
         </w:tc>
@@ -995,7 +1023,7 @@
               <w:rPr>
                 <w:sz w:val="18"/>
               </w:rPr>
-              <w:t>9</w:t>
+              <w:t>107</w:t>
             </w:r>
           </w:p>
         </w:tc>
@@ -1021,7 +1049,7 @@
               <w:rPr>
                 <w:sz w:val="18"/>
               </w:rPr>
-              <w:t>KES 2,064.98</w:t>
+              <w:t>KES 10,700.00</w:t>
             </w:r>
           </w:p>
         </w:tc>
@@ -1036,7 +1064,7 @@
               <w:rPr>
                 <w:sz w:val="18"/>
               </w:rPr>
-              <w:t>7 UP 300ML</w:t>
+              <w:t>KABRAS 2KG WHITE SUGAR</w:t>
             </w:r>
           </w:p>
         </w:tc>
@@ -1049,7 +1077,7 @@
               <w:rPr>
                 <w:sz w:val="18"/>
               </w:rPr>
-              <w:t>25</w:t>
+              <w:t>426</w:t>
             </w:r>
           </w:p>
         </w:tc>
@@ -1075,7 +1103,7 @@
               <w:rPr>
                 <w:sz w:val="18"/>
               </w:rPr>
-              <w:t>KES 1,662.20</w:t>
+              <w:t>KES 42,600.00</w:t>
             </w:r>
           </w:p>
         </w:tc>
@@ -1090,7 +1118,7 @@
               <w:rPr>
                 <w:sz w:val="18"/>
               </w:rPr>
-              <w:t>7 UP 300ML CAN</w:t>
+              <w:t>RINA 5LT VEGETABLE OIL</w:t>
             </w:r>
           </w:p>
         </w:tc>
@@ -1103,7 +1131,7 @@
               <w:rPr>
                 <w:sz w:val="18"/>
               </w:rPr>
-              <w:t>4</w:t>
+              <w:t>42</w:t>
             </w:r>
           </w:p>
         </w:tc>
@@ -1129,7 +1157,7 @@
               <w:rPr>
                 <w:sz w:val="18"/>
               </w:rPr>
-              <w:t>KES 386.20</w:t>
+              <w:t>KES 4,200.00</w:t>
             </w:r>
           </w:p>
         </w:tc>
@@ -1144,7 +1172,7 @@
               <w:rPr>
                 <w:sz w:val="18"/>
               </w:rPr>
-              <w:t>7 UP 350ML EMPTY BOTTLE</w:t>
+              <w:t>FESTIVE 800G WHITE MILKY BREAD</w:t>
             </w:r>
           </w:p>
         </w:tc>
@@ -1157,7 +1185,7 @@
               <w:rPr>
                 <w:sz w:val="18"/>
               </w:rPr>
-              <w:t>25</w:t>
+              <w:t>587</w:t>
             </w:r>
           </w:p>
         </w:tc>
@@ -1183,7 +1211,7 @@
               <w:rPr>
                 <w:sz w:val="18"/>
               </w:rPr>
-              <w:t>KES 375.00</w:t>
+              <w:t>KES 58,700.00</w:t>
             </w:r>
           </w:p>
         </w:tc>
@@ -1198,7 +1226,7 @@
               <w:rPr>
                 <w:sz w:val="18"/>
               </w:rPr>
-              <w:t>7 UP DRINK 500ML PET</w:t>
+              <w:t>SOKO 2KG MAIZE MEAL</w:t>
             </w:r>
           </w:p>
         </w:tc>
@@ -1211,7 +1239,7 @@
               <w:rPr>
                 <w:sz w:val="18"/>
               </w:rPr>
-              <w:t>8</w:t>
+              <w:t>849</w:t>
             </w:r>
           </w:p>
         </w:tc>
@@ -1237,7 +1265,7 @@
               <w:rPr>
                 <w:sz w:val="18"/>
               </w:rPr>
-              <w:t>KES 531.90</w:t>
+              <w:t>KES 84,900.00</w:t>
             </w:r>
           </w:p>
         </w:tc>
@@ -1252,7 +1280,7 @@
               <w:rPr>
                 <w:sz w:val="18"/>
               </w:rPr>
-              <w:t>7 UP SUGAR FREE 300ML CAN</w:t>
+              <w:t>BROOKSIDE 500ML TR FRESH MILK</w:t>
             </w:r>
           </w:p>
         </w:tc>
@@ -1265,7 +1293,7 @@
               <w:rPr>
                 <w:sz w:val="18"/>
               </w:rPr>
-              <w:t>15</w:t>
+              <w:t>68</w:t>
             </w:r>
           </w:p>
         </w:tc>
@@ -1291,7 +1319,7 @@
               <w:rPr>
                 <w:sz w:val="18"/>
               </w:rPr>
-              <w:t>KES 1,448.26</w:t>
+              <w:t>KES 6,800.00</w:t>
             </w:r>
           </w:p>
         </w:tc>
@@ -1306,7 +1334,7 @@
               <w:rPr>
                 <w:sz w:val="18"/>
               </w:rPr>
-              <w:t>7UP 150ML CAN</w:t>
+              <w:t>TUSKER CAN 500ML BEER</w:t>
             </w:r>
           </w:p>
         </w:tc>
@@ -1319,7 +1347,7 @@
               <w:rPr>
                 <w:sz w:val="18"/>
               </w:rPr>
-              <w:t>1</w:t>
+              <w:t>406</w:t>
             </w:r>
           </w:p>
         </w:tc>
@@ -1345,7 +1373,7 @@
               <w:rPr>
                 <w:sz w:val="18"/>
               </w:rPr>
-              <w:t>KES 96.55</w:t>
+              <w:t>KES 40,600.00</w:t>
             </w:r>
           </w:p>
         </w:tc>
@@ -1360,7 +1388,7 @@
               <w:rPr>
                 <w:sz w:val="18"/>
               </w:rPr>
-              <w:t>7UP 2LT PET</w:t>
+              <w:t>BROOKSIDE 500G SALTED BUTTER</w:t>
             </w:r>
           </w:p>
         </w:tc>
@@ -1373,7 +1401,7 @@
               <w:rPr>
                 <w:sz w:val="18"/>
               </w:rPr>
-              <w:t>5</w:t>
+              <w:t>69</w:t>
             </w:r>
           </w:p>
         </w:tc>
@@ -1399,7 +1427,7 @@
               <w:rPr>
                 <w:sz w:val="18"/>
               </w:rPr>
-              <w:t>KES 332.44</w:t>
+              <w:t>KES 6,900.00</w:t>
             </w:r>
           </w:p>
         </w:tc>
@@ -1416,7 +1444,7 @@
           <w:i/>
           <w:sz w:val="22"/>
         </w:rPr>
-        <w:t>... and 9391 more items.</w:t>
+        <w:t>... and 23461 more items.</w:t>
       </w:r>
     </w:p>
     <w:p>
@@ -1429,898 +1457,7 @@
     </w:p>
     <w:p>
       <w:r>
-        <w:t>The human buyer ordered excessively on 34 items compared to the algorithmic recommendation. This signifies potential trapped capital and future dead stock. Estimated over-order waste risk: KES 350,030.52.</w:t>
-      </w:r>
-    </w:p>
-    <w:tbl>
-      <w:tblPr>
-        <w:tblStyle w:val="LightShading-Accent1"/>
-        <w:tblW w:type="auto" w:w="0"/>
-        <w:jc w:val="center"/>
-        <w:tblLook w:firstColumn="1" w:firstRow="1" w:lastColumn="0" w:lastRow="0" w:noHBand="0" w:noVBand="1" w:val="04A0"/>
-      </w:tblPr>
-      <w:tblGrid>
-        <w:gridCol w:w="2880"/>
-        <w:gridCol w:w="2880"/>
-        <w:gridCol w:w="2880"/>
-      </w:tblGrid>
-      <w:tr>
-        <w:tc>
-          <w:tcPr>
-            <w:tcW w:type="dxa" w:w="2880"/>
-          </w:tcPr>
-          <w:p>
-            <w:r>
-              <w:rPr>
-                <w:b/>
-                <w:sz w:val="18"/>
-              </w:rPr>
-              <w:t>Item Name</w:t>
-            </w:r>
-          </w:p>
-        </w:tc>
-        <w:tc>
-          <w:tcPr>
-            <w:tcW w:type="dxa" w:w="2880"/>
-          </w:tcPr>
-          <w:p>
-            <w:r>
-              <w:rPr>
-                <w:b/>
-                <w:sz w:val="18"/>
-              </w:rPr>
-              <w:t>O.A.S.I.S. (Math) Qty</w:t>
-            </w:r>
-          </w:p>
-        </w:tc>
-        <w:tc>
-          <w:tcPr>
-            <w:tcW w:type="dxa" w:w="2880"/>
-          </w:tcPr>
-          <w:p>
-            <w:r>
-              <w:rPr>
-                <w:b/>
-                <w:sz w:val="18"/>
-              </w:rPr>
-              <w:t>Human (Gut) Qty</w:t>
-            </w:r>
-          </w:p>
-        </w:tc>
-      </w:tr>
-      <w:tr>
-        <w:tc>
-          <w:tcPr>
-            <w:tcW w:type="dxa" w:w="2880"/>
-          </w:tcPr>
-          <w:p>
-            <w:r>
-              <w:rPr>
-                <w:sz w:val="18"/>
-              </w:rPr>
-              <w:t>AQUAMIST 20LT MINERAL WATER</w:t>
-            </w:r>
-          </w:p>
-        </w:tc>
-        <w:tc>
-          <w:tcPr>
-            <w:tcW w:type="dxa" w:w="2880"/>
-          </w:tcPr>
-          <w:p>
-            <w:r>
-              <w:rPr>
-                <w:sz w:val="18"/>
-              </w:rPr>
-              <w:t>63</w:t>
-            </w:r>
-          </w:p>
-        </w:tc>
-        <w:tc>
-          <w:tcPr>
-            <w:tcW w:type="dxa" w:w="2880"/>
-          </w:tcPr>
-          <w:p>
-            <w:r>
-              <w:rPr>
-                <w:sz w:val="18"/>
-              </w:rPr>
-              <w:t>124</w:t>
-            </w:r>
-          </w:p>
-        </w:tc>
-      </w:tr>
-      <w:tr>
-        <w:tc>
-          <w:tcPr>
-            <w:tcW w:type="dxa" w:w="2880"/>
-          </w:tcPr>
-          <w:p>
-            <w:r>
-              <w:rPr>
-                <w:sz w:val="18"/>
-              </w:rPr>
-              <w:t>AQUAMIST 20LT MINERAL WATER EMPTY BOTTLE</w:t>
-            </w:r>
-          </w:p>
-        </w:tc>
-        <w:tc>
-          <w:tcPr>
-            <w:tcW w:type="dxa" w:w="2880"/>
-          </w:tcPr>
-          <w:p>
-            <w:r>
-              <w:rPr>
-                <w:sz w:val="18"/>
-              </w:rPr>
-              <w:t>14</w:t>
-            </w:r>
-          </w:p>
-        </w:tc>
-        <w:tc>
-          <w:tcPr>
-            <w:tcW w:type="dxa" w:w="2880"/>
-          </w:tcPr>
-          <w:p>
-            <w:r>
-              <w:rPr>
-                <w:sz w:val="18"/>
-              </w:rPr>
-              <w:t>28</w:t>
-            </w:r>
-          </w:p>
-        </w:tc>
-      </w:tr>
-      <w:tr>
-        <w:tc>
-          <w:tcPr>
-            <w:tcW w:type="dxa" w:w="2880"/>
-          </w:tcPr>
-          <w:p>
-            <w:r>
-              <w:rPr>
-                <w:sz w:val="18"/>
-              </w:rPr>
-              <w:t>BIO 1L FRESH WHOLE MILK</w:t>
-            </w:r>
-          </w:p>
-        </w:tc>
-        <w:tc>
-          <w:tcPr>
-            <w:tcW w:type="dxa" w:w="2880"/>
-          </w:tcPr>
-          <w:p>
-            <w:r>
-              <w:rPr>
-                <w:sz w:val="18"/>
-              </w:rPr>
-              <w:t>19</w:t>
-            </w:r>
-          </w:p>
-        </w:tc>
-        <w:tc>
-          <w:tcPr>
-            <w:tcW w:type="dxa" w:w="2880"/>
-          </w:tcPr>
-          <w:p>
-            <w:r>
-              <w:rPr>
-                <w:sz w:val="18"/>
-              </w:rPr>
-              <w:t>146</w:t>
-            </w:r>
-          </w:p>
-        </w:tc>
-      </w:tr>
-      <w:tr>
-        <w:tc>
-          <w:tcPr>
-            <w:tcW w:type="dxa" w:w="2880"/>
-          </w:tcPr>
-          <w:p>
-            <w:r>
-              <w:rPr>
-                <w:sz w:val="18"/>
-              </w:rPr>
-              <w:t>BIO 200ML GREEK STYLE NATURE PLAIN YOGHU</w:t>
-            </w:r>
-          </w:p>
-        </w:tc>
-        <w:tc>
-          <w:tcPr>
-            <w:tcW w:type="dxa" w:w="2880"/>
-          </w:tcPr>
-          <w:p>
-            <w:r>
-              <w:rPr>
-                <w:sz w:val="18"/>
-              </w:rPr>
-              <w:t>24</w:t>
-            </w:r>
-          </w:p>
-        </w:tc>
-        <w:tc>
-          <w:tcPr>
-            <w:tcW w:type="dxa" w:w="2880"/>
-          </w:tcPr>
-          <w:p>
-            <w:r>
-              <w:rPr>
-                <w:sz w:val="18"/>
-              </w:rPr>
-              <w:t>185</w:t>
-            </w:r>
-          </w:p>
-        </w:tc>
-      </w:tr>
-      <w:tr>
-        <w:tc>
-          <w:tcPr>
-            <w:tcW w:type="dxa" w:w="2880"/>
-          </w:tcPr>
-          <w:p>
-            <w:r>
-              <w:rPr>
-                <w:sz w:val="18"/>
-              </w:rPr>
-              <w:t>BIO 2L SEMI SKIMMED FRESH MILK</w:t>
-            </w:r>
-          </w:p>
-        </w:tc>
-        <w:tc>
-          <w:tcPr>
-            <w:tcW w:type="dxa" w:w="2880"/>
-          </w:tcPr>
-          <w:p>
-            <w:r>
-              <w:rPr>
-                <w:sz w:val="18"/>
-              </w:rPr>
-              <w:t>9</w:t>
-            </w:r>
-          </w:p>
-        </w:tc>
-        <w:tc>
-          <w:tcPr>
-            <w:tcW w:type="dxa" w:w="2880"/>
-          </w:tcPr>
-          <w:p>
-            <w:r>
-              <w:rPr>
-                <w:sz w:val="18"/>
-              </w:rPr>
-              <w:t>73</w:t>
-            </w:r>
-          </w:p>
-        </w:tc>
-      </w:tr>
-      <w:tr>
-        <w:tc>
-          <w:tcPr>
-            <w:tcW w:type="dxa" w:w="2880"/>
-          </w:tcPr>
-          <w:p>
-            <w:r>
-              <w:rPr>
-                <w:sz w:val="18"/>
-              </w:rPr>
-              <w:t>BIO 2L WHOLE FRESH MILK</w:t>
-            </w:r>
-          </w:p>
-        </w:tc>
-        <w:tc>
-          <w:tcPr>
-            <w:tcW w:type="dxa" w:w="2880"/>
-          </w:tcPr>
-          <w:p>
-            <w:r>
-              <w:rPr>
-                <w:sz w:val="18"/>
-              </w:rPr>
-              <w:t>41</w:t>
-            </w:r>
-          </w:p>
-        </w:tc>
-        <w:tc>
-          <w:tcPr>
-            <w:tcW w:type="dxa" w:w="2880"/>
-          </w:tcPr>
-          <w:p>
-            <w:r>
-              <w:rPr>
-                <w:sz w:val="18"/>
-              </w:rPr>
-              <w:t>318</w:t>
-            </w:r>
-          </w:p>
-        </w:tc>
-      </w:tr>
-      <w:tr>
-        <w:tc>
-          <w:tcPr>
-            <w:tcW w:type="dxa" w:w="2880"/>
-          </w:tcPr>
-          <w:p>
-            <w:r>
-              <w:rPr>
-                <w:sz w:val="18"/>
-              </w:rPr>
-              <w:t>BROOKSIDE 1LT UHT WHOLE MILK</w:t>
-            </w:r>
-          </w:p>
-        </w:tc>
-        <w:tc>
-          <w:tcPr>
-            <w:tcW w:type="dxa" w:w="2880"/>
-          </w:tcPr>
-          <w:p>
-            <w:r>
-              <w:rPr>
-                <w:sz w:val="18"/>
-              </w:rPr>
-              <w:t>40</w:t>
-            </w:r>
-          </w:p>
-        </w:tc>
-        <w:tc>
-          <w:tcPr>
-            <w:tcW w:type="dxa" w:w="2880"/>
-          </w:tcPr>
-          <w:p>
-            <w:r>
-              <w:rPr>
-                <w:sz w:val="18"/>
-              </w:rPr>
-              <w:t>312</w:t>
-            </w:r>
-          </w:p>
-        </w:tc>
-      </w:tr>
-      <w:tr>
-        <w:tc>
-          <w:tcPr>
-            <w:tcW w:type="dxa" w:w="2880"/>
-          </w:tcPr>
-          <w:p>
-            <w:r>
-              <w:rPr>
-                <w:sz w:val="18"/>
-              </w:rPr>
-              <w:t>BROOKSIDE 2LTR FRESH MILK STANDARD BOTTL</w:t>
-            </w:r>
-          </w:p>
-        </w:tc>
-        <w:tc>
-          <w:tcPr>
-            <w:tcW w:type="dxa" w:w="2880"/>
-          </w:tcPr>
-          <w:p>
-            <w:r>
-              <w:rPr>
-                <w:sz w:val="18"/>
-              </w:rPr>
-              <w:t>14</w:t>
-            </w:r>
-          </w:p>
-        </w:tc>
-        <w:tc>
-          <w:tcPr>
-            <w:tcW w:type="dxa" w:w="2880"/>
-          </w:tcPr>
-          <w:p>
-            <w:r>
-              <w:rPr>
-                <w:sz w:val="18"/>
-              </w:rPr>
-              <w:t>112</w:t>
-            </w:r>
-          </w:p>
-        </w:tc>
-      </w:tr>
-      <w:tr>
-        <w:tc>
-          <w:tcPr>
-            <w:tcW w:type="dxa" w:w="2880"/>
-          </w:tcPr>
-          <w:p>
-            <w:r>
-              <w:rPr>
-                <w:sz w:val="18"/>
-              </w:rPr>
-              <w:t>BROOKSIDE 2LTR FRESH MILK WHOLE BOTTLE</w:t>
-            </w:r>
-          </w:p>
-        </w:tc>
-        <w:tc>
-          <w:tcPr>
-            <w:tcW w:type="dxa" w:w="2880"/>
-          </w:tcPr>
-          <w:p>
-            <w:r>
-              <w:rPr>
-                <w:sz w:val="18"/>
-              </w:rPr>
-              <w:t>11</w:t>
-            </w:r>
-          </w:p>
-        </w:tc>
-        <w:tc>
-          <w:tcPr>
-            <w:tcW w:type="dxa" w:w="2880"/>
-          </w:tcPr>
-          <w:p>
-            <w:r>
-              <w:rPr>
-                <w:sz w:val="18"/>
-              </w:rPr>
-              <w:t>90</w:t>
-            </w:r>
-          </w:p>
-        </w:tc>
-      </w:tr>
-      <w:tr>
-        <w:tc>
-          <w:tcPr>
-            <w:tcW w:type="dxa" w:w="2880"/>
-          </w:tcPr>
-          <w:p>
-            <w:r>
-              <w:rPr>
-                <w:sz w:val="18"/>
-              </w:rPr>
-              <w:t>BROOKSIDE 500G SALTED BUTTER</w:t>
-            </w:r>
-          </w:p>
-        </w:tc>
-        <w:tc>
-          <w:tcPr>
-            <w:tcW w:type="dxa" w:w="2880"/>
-          </w:tcPr>
-          <w:p>
-            <w:r>
-              <w:rPr>
-                <w:sz w:val="18"/>
-              </w:rPr>
-              <w:t>6</w:t>
-            </w:r>
-          </w:p>
-        </w:tc>
-        <w:tc>
-          <w:tcPr>
-            <w:tcW w:type="dxa" w:w="2880"/>
-          </w:tcPr>
-          <w:p>
-            <w:r>
-              <w:rPr>
-                <w:sz w:val="18"/>
-              </w:rPr>
-              <w:t>47</w:t>
-            </w:r>
-          </w:p>
-        </w:tc>
-      </w:tr>
-      <w:tr>
-        <w:tc>
-          <w:tcPr>
-            <w:tcW w:type="dxa" w:w="2880"/>
-          </w:tcPr>
-          <w:p>
-            <w:r>
-              <w:rPr>
-                <w:sz w:val="18"/>
-              </w:rPr>
-              <w:t>BROOKSIDE 500ML DAIRY BEST (POUCH)</w:t>
-            </w:r>
-          </w:p>
-        </w:tc>
-        <w:tc>
-          <w:tcPr>
-            <w:tcW w:type="dxa" w:w="2880"/>
-          </w:tcPr>
-          <w:p>
-            <w:r>
-              <w:rPr>
-                <w:sz w:val="18"/>
-              </w:rPr>
-              <w:t>485</w:t>
-            </w:r>
-          </w:p>
-        </w:tc>
-        <w:tc>
-          <w:tcPr>
-            <w:tcW w:type="dxa" w:w="2880"/>
-          </w:tcPr>
-          <w:p>
-            <w:r>
-              <w:rPr>
-                <w:sz w:val="18"/>
-              </w:rPr>
-              <w:t>3734</w:t>
-            </w:r>
-          </w:p>
-        </w:tc>
-      </w:tr>
-      <w:tr>
-        <w:tc>
-          <w:tcPr>
-            <w:tcW w:type="dxa" w:w="2880"/>
-          </w:tcPr>
-          <w:p>
-            <w:r>
-              <w:rPr>
-                <w:sz w:val="18"/>
-              </w:rPr>
-              <w:t>BROOKSIDE 500ML TR FRESH MILK</w:t>
-            </w:r>
-          </w:p>
-        </w:tc>
-        <w:tc>
-          <w:tcPr>
-            <w:tcW w:type="dxa" w:w="2880"/>
-          </w:tcPr>
-          <w:p>
-            <w:r>
-              <w:rPr>
-                <w:sz w:val="18"/>
-              </w:rPr>
-              <w:t>73</w:t>
-            </w:r>
-          </w:p>
-        </w:tc>
-        <w:tc>
-          <w:tcPr>
-            <w:tcW w:type="dxa" w:w="2880"/>
-          </w:tcPr>
-          <w:p>
-            <w:r>
-              <w:rPr>
-                <w:sz w:val="18"/>
-              </w:rPr>
-              <w:t>565</w:t>
-            </w:r>
-          </w:p>
-        </w:tc>
-      </w:tr>
-      <w:tr>
-        <w:tc>
-          <w:tcPr>
-            <w:tcW w:type="dxa" w:w="2880"/>
-          </w:tcPr>
-          <w:p>
-            <w:r>
-              <w:rPr>
-                <w:sz w:val="18"/>
-              </w:rPr>
-              <w:t>FC 1KG (14D) BEEF VALUE SAUSAGES</w:t>
-            </w:r>
-          </w:p>
-        </w:tc>
-        <w:tc>
-          <w:tcPr>
-            <w:tcW w:type="dxa" w:w="2880"/>
-          </w:tcPr>
-          <w:p>
-            <w:r>
-              <w:rPr>
-                <w:sz w:val="18"/>
-              </w:rPr>
-              <w:t>11</w:t>
-            </w:r>
-          </w:p>
-        </w:tc>
-        <w:tc>
-          <w:tcPr>
-            <w:tcW w:type="dxa" w:w="2880"/>
-          </w:tcPr>
-          <w:p>
-            <w:r>
-              <w:rPr>
-                <w:sz w:val="18"/>
-              </w:rPr>
-              <w:t>30</w:t>
-            </w:r>
-          </w:p>
-        </w:tc>
-      </w:tr>
-      <w:tr>
-        <w:tc>
-          <w:tcPr>
-            <w:tcW w:type="dxa" w:w="2880"/>
-          </w:tcPr>
-          <w:p>
-            <w:r>
-              <w:rPr>
-                <w:sz w:val="18"/>
-              </w:rPr>
-              <w:t>FC 1KG (14D) FRESH PORK VALUE PACK</w:t>
-            </w:r>
-          </w:p>
-        </w:tc>
-        <w:tc>
-          <w:tcPr>
-            <w:tcW w:type="dxa" w:w="2880"/>
-          </w:tcPr>
-          <w:p>
-            <w:r>
-              <w:rPr>
-                <w:sz w:val="18"/>
-              </w:rPr>
-              <w:t>13</w:t>
-            </w:r>
-          </w:p>
-        </w:tc>
-        <w:tc>
-          <w:tcPr>
-            <w:tcW w:type="dxa" w:w="2880"/>
-          </w:tcPr>
-          <w:p>
-            <w:r>
-              <w:rPr>
-                <w:sz w:val="18"/>
-              </w:rPr>
-              <w:t>34</w:t>
-            </w:r>
-          </w:p>
-        </w:tc>
-      </w:tr>
-      <w:tr>
-        <w:tc>
-          <w:tcPr>
-            <w:tcW w:type="dxa" w:w="2880"/>
-          </w:tcPr>
-          <w:p>
-            <w:r>
-              <w:rPr>
-                <w:sz w:val="18"/>
-              </w:rPr>
-              <w:t>FC 400G (30D) FRESH STREAKY BACON</w:t>
-            </w:r>
-          </w:p>
-        </w:tc>
-        <w:tc>
-          <w:tcPr>
-            <w:tcW w:type="dxa" w:w="2880"/>
-          </w:tcPr>
-          <w:p>
-            <w:r>
-              <w:rPr>
-                <w:sz w:val="18"/>
-              </w:rPr>
-              <w:t>10</w:t>
-            </w:r>
-          </w:p>
-        </w:tc>
-        <w:tc>
-          <w:tcPr>
-            <w:tcW w:type="dxa" w:w="2880"/>
-          </w:tcPr>
-          <w:p>
-            <w:r>
-              <w:rPr>
-                <w:sz w:val="18"/>
-              </w:rPr>
-              <w:t>27</w:t>
-            </w:r>
-          </w:p>
-        </w:tc>
-      </w:tr>
-      <w:tr>
-        <w:tc>
-          <w:tcPr>
-            <w:tcW w:type="dxa" w:w="2880"/>
-          </w:tcPr>
-          <w:p>
-            <w:r>
-              <w:rPr>
-                <w:sz w:val="18"/>
-              </w:rPr>
-              <w:t>FESTIVE 400G MILKY WHITE SLICED</w:t>
-            </w:r>
-          </w:p>
-        </w:tc>
-        <w:tc>
-          <w:tcPr>
-            <w:tcW w:type="dxa" w:w="2880"/>
-          </w:tcPr>
-          <w:p>
-            <w:r>
-              <w:rPr>
-                <w:sz w:val="18"/>
-              </w:rPr>
-              <w:t>42</w:t>
-            </w:r>
-          </w:p>
-        </w:tc>
-        <w:tc>
-          <w:tcPr>
-            <w:tcW w:type="dxa" w:w="2880"/>
-          </w:tcPr>
-          <w:p>
-            <w:r>
-              <w:rPr>
-                <w:sz w:val="18"/>
-              </w:rPr>
-              <w:t>328</w:t>
-            </w:r>
-          </w:p>
-        </w:tc>
-      </w:tr>
-      <w:tr>
-        <w:tc>
-          <w:tcPr>
-            <w:tcW w:type="dxa" w:w="2880"/>
-          </w:tcPr>
-          <w:p>
-            <w:r>
-              <w:rPr>
-                <w:sz w:val="18"/>
-              </w:rPr>
-              <w:t>FESTIVE 600G FAMILY WHITE BREAD</w:t>
-            </w:r>
-          </w:p>
-        </w:tc>
-        <w:tc>
-          <w:tcPr>
-            <w:tcW w:type="dxa" w:w="2880"/>
-          </w:tcPr>
-          <w:p>
-            <w:r>
-              <w:rPr>
-                <w:sz w:val="18"/>
-              </w:rPr>
-              <w:t>36</w:t>
-            </w:r>
-          </w:p>
-        </w:tc>
-        <w:tc>
-          <w:tcPr>
-            <w:tcW w:type="dxa" w:w="2880"/>
-          </w:tcPr>
-          <w:p>
-            <w:r>
-              <w:rPr>
-                <w:sz w:val="18"/>
-              </w:rPr>
-              <w:t>280</w:t>
-            </w:r>
-          </w:p>
-        </w:tc>
-      </w:tr>
-      <w:tr>
-        <w:tc>
-          <w:tcPr>
-            <w:tcW w:type="dxa" w:w="2880"/>
-          </w:tcPr>
-          <w:p>
-            <w:r>
-              <w:rPr>
-                <w:sz w:val="18"/>
-              </w:rPr>
-              <w:t>FESTIVE 800G WHITE MILKY BREAD</w:t>
-            </w:r>
-          </w:p>
-        </w:tc>
-        <w:tc>
-          <w:tcPr>
-            <w:tcW w:type="dxa" w:w="2880"/>
-          </w:tcPr>
-          <w:p>
-            <w:r>
-              <w:rPr>
-                <w:sz w:val="18"/>
-              </w:rPr>
-              <w:t>38</w:t>
-            </w:r>
-          </w:p>
-        </w:tc>
-        <w:tc>
-          <w:tcPr>
-            <w:tcW w:type="dxa" w:w="2880"/>
-          </w:tcPr>
-          <w:p>
-            <w:r>
-              <w:rPr>
-                <w:sz w:val="18"/>
-              </w:rPr>
-              <w:t>295</w:t>
-            </w:r>
-          </w:p>
-        </w:tc>
-      </w:tr>
-      <w:tr>
-        <w:tc>
-          <w:tcPr>
-            <w:tcW w:type="dxa" w:w="2880"/>
-          </w:tcPr>
-          <w:p>
-            <w:r>
-              <w:rPr>
-                <w:sz w:val="18"/>
-              </w:rPr>
-              <w:t>FRESHA 5L WHOLE MILK</w:t>
-            </w:r>
-          </w:p>
-        </w:tc>
-        <w:tc>
-          <w:tcPr>
-            <w:tcW w:type="dxa" w:w="2880"/>
-          </w:tcPr>
-          <w:p>
-            <w:r>
-              <w:rPr>
-                <w:sz w:val="18"/>
-              </w:rPr>
-              <w:t>9</w:t>
-            </w:r>
-          </w:p>
-        </w:tc>
-        <w:tc>
-          <w:tcPr>
-            <w:tcW w:type="dxa" w:w="2880"/>
-          </w:tcPr>
-          <w:p>
-            <w:r>
-              <w:rPr>
-                <w:sz w:val="18"/>
-              </w:rPr>
-              <w:t>71</w:t>
-            </w:r>
-          </w:p>
-        </w:tc>
-      </w:tr>
-      <w:tr>
-        <w:tc>
-          <w:tcPr>
-            <w:tcW w:type="dxa" w:w="2880"/>
-          </w:tcPr>
-          <w:p>
-            <w:r>
-              <w:rPr>
-                <w:sz w:val="18"/>
-              </w:rPr>
-              <w:t>GOLD 500ML CROWN TFA 20</w:t>
-            </w:r>
-          </w:p>
-        </w:tc>
-        <w:tc>
-          <w:tcPr>
-            <w:tcW w:type="dxa" w:w="2880"/>
-          </w:tcPr>
-          <w:p>
-            <w:r>
-              <w:rPr>
-                <w:sz w:val="18"/>
-              </w:rPr>
-              <w:t>26</w:t>
-            </w:r>
-          </w:p>
-        </w:tc>
-        <w:tc>
-          <w:tcPr>
-            <w:tcW w:type="dxa" w:w="2880"/>
-          </w:tcPr>
-          <w:p>
-            <w:r>
-              <w:rPr>
-                <w:sz w:val="18"/>
-              </w:rPr>
-              <w:t>207</w:t>
-            </w:r>
-          </w:p>
-        </w:tc>
-      </w:tr>
-    </w:tbl>
-    <w:p/>
-    <w:p>
-      <w:pPr>
-        <w:spacing w:after="120"/>
-      </w:pPr>
-      <w:r>
-        <w:rPr>
-          <w:b w:val="0"/>
-          <w:i/>
-          <w:sz w:val="22"/>
-        </w:rPr>
-        <w:t>... and 14 more items.</w:t>
+        <w:t>The human buyer ordered excessively on 0 items compared to the algorithmic recommendation. This signifies potential trapped capital and future dead stock. Extrapolated Capital Waste (Annualized 17% Holding Cost): KES 0.00.</w:t>
       </w:r>
     </w:p>
     <w:p>

</xml_diff>